<commit_message>
remove verify_only/sign_only, adobeSignFieldValue, and sigLogoAltText from documentation (they are not implemented)
</commit_message>
<xml_diff>
--- a/doc/PDFAS5_Profile_Dokumentation.docx
+++ b/doc/PDFAS5_Profile_Dokumentation.docx
@@ -486,25 +486,7 @@
                 <w:szCs w:val="22"/>
                 <w:lang w:val="en-US"/>
               </w:rPr>
-              <w:t xml:space="preserve">Christian </w:t>
-            </w:r>
-            <w:proofErr w:type="spellStart"/>
-            <w:r>
-              <w:rPr>
-                <w:sz w:val="22"/>
-                <w:szCs w:val="22"/>
-                <w:lang w:val="en-US"/>
-              </w:rPr>
-              <w:t>Maierhofer</w:t>
-            </w:r>
-            <w:proofErr w:type="spellEnd"/>
-            <w:r>
-              <w:rPr>
-                <w:sz w:val="22"/>
-                <w:szCs w:val="22"/>
-                <w:lang w:val="en-US"/>
-              </w:rPr>
-              <w:t xml:space="preserve"> – </w:t>
+              <w:t xml:space="preserve">Christian Maierhofer – </w:t>
             </w:r>
             <w:hyperlink r:id="rId11" w:history="1">
               <w:r>
@@ -604,21 +586,12 @@
         </w:rPr>
         <w:t>Zusammenfass</w:t>
       </w:r>
-      <w:proofErr w:type="spellStart"/>
       <w:r>
         <w:rPr>
           <w:b/>
           <w:color w:val="4C483D"/>
         </w:rPr>
-        <w:t>ung</w:t>
-      </w:r>
-      <w:proofErr w:type="spellEnd"/>
-      <w:r>
-        <w:rPr>
-          <w:b/>
-          <w:color w:val="4C483D"/>
-        </w:rPr>
-        <w:t>:</w:t>
+        <w:t>ung:</w:t>
       </w:r>
       <w:r>
         <w:rPr>
@@ -633,15 +606,7 @@
         <w:t>m</w:t>
       </w:r>
       <w:r>
-        <w:t xml:space="preserve"> </w:t>
-      </w:r>
-      <w:proofErr w:type="spellStart"/>
-      <w:r>
-        <w:t>PAdES</w:t>
-      </w:r>
-      <w:proofErr w:type="spellEnd"/>
-      <w:r>
-        <w:t xml:space="preserve"> Standard. </w:t>
+        <w:t xml:space="preserve"> PAdES Standard. </w:t>
       </w:r>
       <w:r>
         <w:t>Die visuelle Darstellung der Signatur im Dokument ist wird über sogenannte Signaturprofile gesteuert. Dieses Dokument enthält Detail zu den b</w:t>
@@ -668,6 +633,8 @@
         <w:t>Inhaltsverzeichnis</w:t>
       </w:r>
     </w:p>
+    <w:bookmarkStart w:id="0" w:name="_GoBack"/>
+    <w:bookmarkEnd w:id="0"/>
     <w:p>
       <w:pPr>
         <w:pStyle w:val="TOC1"/>
@@ -678,7 +645,7 @@
           <w:rFonts w:asciiTheme="minorHAnsi" w:hAnsiTheme="minorHAnsi"/>
           <w:noProof/>
           <w:color w:val="auto"/>
-          <w:lang w:val="en-US" w:eastAsia="en-US"/>
+          <w:lang w:val="en-AT" w:eastAsia="en-AT"/>
         </w:rPr>
       </w:pPr>
       <w:r>
@@ -690,7 +657,7 @@
       <w:r>
         <w:fldChar w:fldCharType="separate"/>
       </w:r>
-      <w:hyperlink w:anchor="_Toc417992170" w:history="1">
+      <w:hyperlink w:anchor="_Toc229414980" w:history="1">
         <w:r>
           <w:rPr>
             <w:rStyle w:val="Hyperlink"/>
@@ -717,7 +684,7 @@
             <w:noProof/>
             <w:webHidden/>
           </w:rPr>
-          <w:instrText xml:space="preserve"> PAGEREF _Toc417992170 \h </w:instrText>
+          <w:instrText xml:space="preserve"> PAGEREF _Toc229414980 \h </w:instrText>
         </w:r>
         <w:r>
           <w:rPr>
@@ -758,10 +725,10 @@
           <w:rFonts w:asciiTheme="minorHAnsi" w:hAnsiTheme="minorHAnsi"/>
           <w:noProof/>
           <w:color w:val="auto"/>
-          <w:lang w:val="en-US" w:eastAsia="en-US"/>
+          <w:lang w:val="en-AT" w:eastAsia="en-AT"/>
         </w:rPr>
       </w:pPr>
-      <w:hyperlink w:anchor="_Toc417992171" w:history="1">
+      <w:hyperlink w:anchor="_Toc229414981" w:history="1">
         <w:r>
           <w:rPr>
             <w:rStyle w:val="Hyperlink"/>
@@ -788,7 +755,7 @@
             <w:noProof/>
             <w:webHidden/>
           </w:rPr>
-          <w:instrText xml:space="preserve"> PAGEREF _Toc417992171 \h </w:instrText>
+          <w:instrText xml:space="preserve"> PAGEREF _Toc229414981 \h </w:instrText>
         </w:r>
         <w:r>
           <w:rPr>
@@ -829,10 +796,10 @@
           <w:rFonts w:asciiTheme="minorHAnsi" w:hAnsiTheme="minorHAnsi"/>
           <w:noProof/>
           <w:color w:val="auto"/>
-          <w:lang w:val="en-US" w:eastAsia="en-US"/>
+          <w:lang w:val="en-AT" w:eastAsia="en-AT"/>
         </w:rPr>
       </w:pPr>
-      <w:hyperlink w:anchor="_Toc417992172" w:history="1">
+      <w:hyperlink w:anchor="_Toc229414982" w:history="1">
         <w:r>
           <w:rPr>
             <w:rStyle w:val="Hyperlink"/>
@@ -872,7 +839,7 @@
             <w:noProof/>
             <w:webHidden/>
           </w:rPr>
-          <w:instrText xml:space="preserve"> PAGEREF _Toc417992172 \h </w:instrText>
+          <w:instrText xml:space="preserve"> PAGEREF _Toc229414982 \h </w:instrText>
         </w:r>
         <w:r>
           <w:rPr>
@@ -913,10 +880,10 @@
           <w:rFonts w:asciiTheme="minorHAnsi" w:hAnsiTheme="minorHAnsi"/>
           <w:noProof/>
           <w:color w:val="auto"/>
-          <w:lang w:val="en-US" w:eastAsia="en-US"/>
+          <w:lang w:val="en-AT" w:eastAsia="en-AT"/>
         </w:rPr>
       </w:pPr>
-      <w:hyperlink w:anchor="_Toc417992173" w:history="1">
+      <w:hyperlink w:anchor="_Toc229414983" w:history="1">
         <w:r>
           <w:rPr>
             <w:rStyle w:val="Hyperlink"/>
@@ -956,7 +923,7 @@
             <w:noProof/>
             <w:webHidden/>
           </w:rPr>
-          <w:instrText xml:space="preserve"> PAGEREF _Toc417992173 \h </w:instrText>
+          <w:instrText xml:space="preserve"> PAGEREF _Toc229414983 \h </w:instrText>
         </w:r>
         <w:r>
           <w:rPr>
@@ -997,10 +964,10 @@
           <w:rFonts w:asciiTheme="minorHAnsi" w:hAnsiTheme="minorHAnsi"/>
           <w:noProof/>
           <w:color w:val="auto"/>
-          <w:lang w:val="en-US" w:eastAsia="en-US"/>
+          <w:lang w:val="en-AT" w:eastAsia="en-AT"/>
         </w:rPr>
       </w:pPr>
-      <w:hyperlink w:anchor="_Toc417992174" w:history="1">
+      <w:hyperlink w:anchor="_Toc229414984" w:history="1">
         <w:r>
           <w:rPr>
             <w:rStyle w:val="Hyperlink"/>
@@ -1027,7 +994,7 @@
             <w:noProof/>
             <w:webHidden/>
           </w:rPr>
-          <w:instrText xml:space="preserve"> PAGEREF _Toc417992174 \h </w:instrText>
+          <w:instrText xml:space="preserve"> PAGEREF _Toc229414984 \h </w:instrText>
         </w:r>
         <w:r>
           <w:rPr>
@@ -1068,10 +1035,10 @@
           <w:rFonts w:asciiTheme="minorHAnsi" w:hAnsiTheme="minorHAnsi"/>
           <w:noProof/>
           <w:color w:val="auto"/>
-          <w:lang w:val="en-US" w:eastAsia="en-US"/>
+          <w:lang w:val="en-AT" w:eastAsia="en-AT"/>
         </w:rPr>
       </w:pPr>
-      <w:hyperlink w:anchor="_Toc417992175" w:history="1">
+      <w:hyperlink w:anchor="_Toc229414985" w:history="1">
         <w:r>
           <w:rPr>
             <w:rStyle w:val="Hyperlink"/>
@@ -1111,7 +1078,7 @@
             <w:noProof/>
             <w:webHidden/>
           </w:rPr>
-          <w:instrText xml:space="preserve"> PAGEREF _Toc417992175 \h </w:instrText>
+          <w:instrText xml:space="preserve"> PAGEREF _Toc229414985 \h </w:instrText>
         </w:r>
         <w:r>
           <w:rPr>
@@ -1152,10 +1119,10 @@
           <w:rFonts w:asciiTheme="minorHAnsi" w:hAnsiTheme="minorHAnsi"/>
           <w:noProof/>
           <w:color w:val="auto"/>
-          <w:lang w:val="en-US" w:eastAsia="en-US"/>
+          <w:lang w:val="en-AT" w:eastAsia="en-AT"/>
         </w:rPr>
       </w:pPr>
-      <w:hyperlink w:anchor="_Toc417992176" w:history="1">
+      <w:hyperlink w:anchor="_Toc229414986" w:history="1">
         <w:r>
           <w:rPr>
             <w:rStyle w:val="Hyperlink"/>
@@ -1195,7 +1162,7 @@
             <w:noProof/>
             <w:webHidden/>
           </w:rPr>
-          <w:instrText xml:space="preserve"> PAGEREF _Toc417992176 \h </w:instrText>
+          <w:instrText xml:space="preserve"> PAGEREF _Toc229414986 \h </w:instrText>
         </w:r>
         <w:r>
           <w:rPr>
@@ -1215,7 +1182,7 @@
             <w:noProof/>
             <w:webHidden/>
           </w:rPr>
-          <w:t>9</w:t>
+          <w:t>8</w:t>
         </w:r>
         <w:r>
           <w:rPr>
@@ -1236,10 +1203,10 @@
           <w:rFonts w:asciiTheme="minorHAnsi" w:hAnsiTheme="minorHAnsi"/>
           <w:noProof/>
           <w:color w:val="auto"/>
-          <w:lang w:val="en-US" w:eastAsia="en-US"/>
+          <w:lang w:val="en-AT" w:eastAsia="en-AT"/>
         </w:rPr>
       </w:pPr>
-      <w:hyperlink w:anchor="_Toc417992177" w:history="1">
+      <w:hyperlink w:anchor="_Toc229414987" w:history="1">
         <w:r>
           <w:rPr>
             <w:rStyle w:val="Hyperlink"/>
@@ -1266,7 +1233,7 @@
             <w:noProof/>
             <w:webHidden/>
           </w:rPr>
-          <w:instrText xml:space="preserve"> PAGEREF _Toc417992177 \h </w:instrText>
+          <w:instrText xml:space="preserve"> PAGEREF _Toc229414987 \h </w:instrText>
         </w:r>
         <w:r>
           <w:rPr>
@@ -1307,10 +1274,10 @@
           <w:rFonts w:asciiTheme="minorHAnsi" w:hAnsiTheme="minorHAnsi"/>
           <w:noProof/>
           <w:color w:val="auto"/>
-          <w:lang w:val="en-US" w:eastAsia="en-US"/>
+          <w:lang w:val="en-AT" w:eastAsia="en-AT"/>
         </w:rPr>
       </w:pPr>
-      <w:hyperlink w:anchor="_Toc417992178" w:history="1">
+      <w:hyperlink w:anchor="_Toc229414988" w:history="1">
         <w:r>
           <w:rPr>
             <w:rStyle w:val="Hyperlink"/>
@@ -1350,7 +1317,7 @@
             <w:noProof/>
             <w:webHidden/>
           </w:rPr>
-          <w:instrText xml:space="preserve"> PAGEREF _Toc417992178 \h </w:instrText>
+          <w:instrText xml:space="preserve"> PAGEREF _Toc229414988 \h </w:instrText>
         </w:r>
         <w:r>
           <w:rPr>
@@ -1391,10 +1358,10 @@
           <w:rFonts w:asciiTheme="minorHAnsi" w:hAnsiTheme="minorHAnsi"/>
           <w:noProof/>
           <w:color w:val="auto"/>
-          <w:lang w:val="en-US" w:eastAsia="en-US"/>
+          <w:lang w:val="en-AT" w:eastAsia="en-AT"/>
         </w:rPr>
       </w:pPr>
-      <w:hyperlink w:anchor="_Toc417992179" w:history="1">
+      <w:hyperlink w:anchor="_Toc229414989" w:history="1">
         <w:r>
           <w:rPr>
             <w:rStyle w:val="Hyperlink"/>
@@ -1434,7 +1401,7 @@
             <w:noProof/>
             <w:webHidden/>
           </w:rPr>
-          <w:instrText xml:space="preserve"> PAGEREF _Toc417992179 \h </w:instrText>
+          <w:instrText xml:space="preserve"> PAGEREF _Toc229414989 \h </w:instrText>
         </w:r>
         <w:r>
           <w:rPr>
@@ -1475,10 +1442,10 @@
           <w:rFonts w:asciiTheme="minorHAnsi" w:hAnsiTheme="minorHAnsi"/>
           <w:noProof/>
           <w:color w:val="auto"/>
-          <w:lang w:val="en-US" w:eastAsia="en-US"/>
+          <w:lang w:val="en-AT" w:eastAsia="en-AT"/>
         </w:rPr>
       </w:pPr>
-      <w:hyperlink w:anchor="_Toc417992180" w:history="1">
+      <w:hyperlink w:anchor="_Toc229414990" w:history="1">
         <w:r>
           <w:rPr>
             <w:rStyle w:val="Hyperlink"/>
@@ -1526,7 +1493,7 @@
             <w:noProof/>
             <w:webHidden/>
           </w:rPr>
-          <w:instrText xml:space="preserve"> PAGEREF _Toc417992180 \h </w:instrText>
+          <w:instrText xml:space="preserve"> PAGEREF _Toc229414990 \h </w:instrText>
         </w:r>
         <w:r>
           <w:rPr>
@@ -1571,16 +1538,16 @@
       <w:pPr>
         <w:pStyle w:val="Heading1"/>
       </w:pPr>
-      <w:bookmarkStart w:id="0" w:name="_Toc129153041"/>
-      <w:bookmarkStart w:id="1" w:name="_Toc379351812"/>
-      <w:bookmarkStart w:id="2" w:name="_Toc417992170"/>
+      <w:bookmarkStart w:id="1" w:name="_Toc129153041"/>
+      <w:bookmarkStart w:id="2" w:name="_Toc379351812"/>
+      <w:bookmarkStart w:id="3" w:name="_Toc229414980"/>
       <w:r>
         <w:lastRenderedPageBreak/>
         <w:t>Kurzbeschreibung</w:t>
       </w:r>
-      <w:bookmarkEnd w:id="0"/>
       <w:bookmarkEnd w:id="1"/>
       <w:bookmarkEnd w:id="2"/>
+      <w:bookmarkEnd w:id="3"/>
     </w:p>
     <w:p>
       <w:r>
@@ -1614,12 +1581,12 @@
       <w:pPr>
         <w:pStyle w:val="Heading1"/>
       </w:pPr>
-      <w:bookmarkStart w:id="3" w:name="_Toc417992171"/>
+      <w:bookmarkStart w:id="4" w:name="_Toc229414981"/>
       <w:r>
         <w:lastRenderedPageBreak/>
         <w:t>Profilstruktur</w:t>
       </w:r>
-      <w:bookmarkEnd w:id="3"/>
+      <w:bookmarkEnd w:id="4"/>
     </w:p>
     <w:p>
       <w:r>
@@ -1633,14 +1600,14 @@
       <w:pPr>
         <w:pStyle w:val="Heading2"/>
       </w:pPr>
-      <w:bookmarkStart w:id="4" w:name="_Toc417992172"/>
+      <w:bookmarkStart w:id="5" w:name="_Toc229414982"/>
       <w:r>
         <w:t>Basis</w:t>
       </w:r>
       <w:r>
         <w:t>profile</w:t>
       </w:r>
-      <w:bookmarkEnd w:id="4"/>
+      <w:bookmarkEnd w:id="5"/>
     </w:p>
     <w:p>
       <w:r>
@@ -1923,7 +1890,6 @@
             <w:pPr>
               <w:pStyle w:val="Beschreibung"/>
             </w:pPr>
-            <w:proofErr w:type="spellStart"/>
             <w:r>
               <w:t>B</w:t>
             </w:r>
@@ -1931,11 +1897,7 @@
               <w:t>asiprofileinträ</w:t>
             </w:r>
             <w:r>
-              <w:t>ge</w:t>
-            </w:r>
-            <w:proofErr w:type="spellEnd"/>
-            <w:r>
-              <w:t xml:space="preserve"> </w:t>
+              <w:t xml:space="preserve">ge </w:t>
             </w:r>
             <w:r>
               <w:t xml:space="preserve">und zusätzlicher </w:t>
@@ -2006,8 +1968,6 @@
             <w:r>
               <w:t xml:space="preserve"> breit</w:t>
             </w:r>
-            <w:bookmarkStart w:id="5" w:name="_GoBack"/>
-            <w:bookmarkEnd w:id="5"/>
           </w:p>
         </w:tc>
       </w:tr>
@@ -2074,7 +2034,7 @@
       <w:pPr>
         <w:pStyle w:val="Heading2"/>
       </w:pPr>
-      <w:bookmarkStart w:id="6" w:name="_Toc417992173"/>
+      <w:bookmarkStart w:id="6" w:name="_Toc229414983"/>
       <w:r>
         <w:t>Standardsignaturprofile</w:t>
       </w:r>
@@ -2666,7 +2626,7 @@
       <w:pPr>
         <w:pStyle w:val="Heading1"/>
       </w:pPr>
-      <w:bookmarkStart w:id="7" w:name="_Toc417992174"/>
+      <w:bookmarkStart w:id="7" w:name="_Toc229414984"/>
       <w:r>
         <w:lastRenderedPageBreak/>
         <w:t>Profilparameter</w:t>
@@ -2677,7 +2637,7 @@
       <w:pPr>
         <w:pStyle w:val="Heading2"/>
       </w:pPr>
-      <w:bookmarkStart w:id="8" w:name="_Toc417992175"/>
+      <w:bookmarkStart w:id="8" w:name="_Toc229414985"/>
       <w:r>
         <w:t xml:space="preserve">Allgemeine </w:t>
       </w:r>
@@ -2688,34 +2648,10 @@
     </w:p>
     <w:p>
       <w:r>
-        <w:t xml:space="preserve">Die Basis- bzw. Signaturprofile werden über </w:t>
-      </w:r>
-      <w:proofErr w:type="spellStart"/>
-      <w:r>
-        <w:t>key-value</w:t>
-      </w:r>
-      <w:proofErr w:type="spellEnd"/>
-      <w:r>
-        <w:t xml:space="preserve"> Paare definiert. Diese Parameter werden im Folgenden erläutert. &lt;PROFILE&gt; steht dabei für den eigentlichen Profil-Identifier (</w:t>
-      </w:r>
-      <w:proofErr w:type="spellStart"/>
-      <w:r>
-        <w:t>zb</w:t>
-      </w:r>
-      <w:proofErr w:type="spellEnd"/>
-      <w:r>
-        <w:t>: BASE_NORMAL)</w:t>
-      </w:r>
-      <w:r>
-        <w:t xml:space="preserve">. Das Präfix für jeden Parameter ist immer </w:t>
-      </w:r>
-      <w:proofErr w:type="spellStart"/>
-      <w:r>
-        <w:t>sig_obj</w:t>
-      </w:r>
-      <w:proofErr w:type="spellEnd"/>
-      <w:r>
-        <w:t>.&lt;PRO</w:t>
+        <w:t>Die Basis- bzw. Signaturprofile werden über key-value Paare definiert. Diese Parameter werden im Folgenden erläutert. &lt;PROFILE&gt; steht dabei für den eigentlichen Profil-Identifier (zb: BASE_NORMAL)</w:t>
+      </w:r>
+      <w:r>
+        <w:t>. Das Präfix für jeden Parameter ist immer sig_obj.&lt;PRO</w:t>
       </w:r>
       <w:r>
         <w:t>FILE&gt;</w:t>
@@ -2879,33 +2815,10 @@
                 <w:lang w:val="en-US"/>
               </w:rPr>
             </w:pPr>
-            <w:proofErr w:type="spellStart"/>
             <w:r>
               <w:rPr>
                 <w:lang w:val="en-US"/>
               </w:rPr>
-              <w:t>verify_only</w:t>
-            </w:r>
-            <w:proofErr w:type="spellEnd"/>
-            <w:r>
-              <w:rPr>
-                <w:lang w:val="en-US"/>
-              </w:rPr>
-              <w:br/>
-            </w:r>
-            <w:proofErr w:type="spellStart"/>
-            <w:r>
-              <w:rPr>
-                <w:lang w:val="en-US"/>
-              </w:rPr>
-              <w:t>sign_only</w:t>
-            </w:r>
-            <w:proofErr w:type="spellEnd"/>
-            <w:r>
-              <w:rPr>
-                <w:lang w:val="en-US"/>
-              </w:rPr>
-              <w:br/>
               <w:t>on</w:t>
             </w:r>
             <w:r>
@@ -2921,74 +2834,6 @@
           <w:tcPr>
             <w:tcW w:w="4682" w:type="dxa"/>
           </w:tcPr>
-          <w:p>
-            <w:pPr>
-              <w:pStyle w:val="Beschreibung"/>
-              <w:rPr>
-                <w:lang w:val="de-DE"/>
-              </w:rPr>
-            </w:pPr>
-            <w:proofErr w:type="spellStart"/>
-            <w:r>
-              <w:rPr>
-                <w:lang w:val="de-DE"/>
-              </w:rPr>
-              <w:t>verify_only</w:t>
-            </w:r>
-            <w:proofErr w:type="spellEnd"/>
-            <w:r>
-              <w:rPr>
-                <w:lang w:val="de-DE"/>
-              </w:rPr>
-              <w:t xml:space="preserve"> - </w:t>
-            </w:r>
-            <w:r>
-              <w:rPr>
-                <w:lang w:val="de-DE"/>
-              </w:rPr>
-              <w:t>Profil kann nur zum Verifizieren, nicht aber zum S</w:t>
-            </w:r>
-            <w:r>
-              <w:rPr>
-                <w:lang w:val="de-DE"/>
-              </w:rPr>
-              <w:t xml:space="preserve">ignieren verwendet </w:t>
-            </w:r>
-            <w:r>
-              <w:rPr>
-                <w:lang w:val="de-DE"/>
-              </w:rPr>
-              <w:t>we</w:t>
-            </w:r>
-            <w:r>
-              <w:rPr>
-                <w:lang w:val="de-DE"/>
-              </w:rPr>
-              <w:t>rden.</w:t>
-            </w:r>
-          </w:p>
-          <w:p>
-            <w:pPr>
-              <w:pStyle w:val="Beschreibung"/>
-              <w:rPr>
-                <w:lang w:val="de-DE"/>
-              </w:rPr>
-            </w:pPr>
-            <w:proofErr w:type="spellStart"/>
-            <w:r>
-              <w:rPr>
-                <w:lang w:val="de-DE"/>
-              </w:rPr>
-              <w:t>sign_only</w:t>
-            </w:r>
-            <w:proofErr w:type="spellEnd"/>
-            <w:r>
-              <w:rPr>
-                <w:lang w:val="de-DE"/>
-              </w:rPr>
-              <w:t xml:space="preserve"> – Profil kann nur zum Signieren verwendet werden</w:t>
-            </w:r>
-          </w:p>
           <w:p>
             <w:pPr>
               <w:pStyle w:val="Beschreibung"/>
@@ -3123,42 +2968,12 @@
                 <w:lang w:val="en-US"/>
               </w:rPr>
             </w:pPr>
-            <w:proofErr w:type="spellStart"/>
             <w:r>
               <w:rPr>
                 <w:lang w:val="en-US"/>
               </w:rPr>
-              <w:t>Unterzeichner</w:t>
-            </w:r>
-            <w:proofErr w:type="spellEnd"/>
-            <w:r>
-              <w:rPr>
-                <w:lang w:val="en-US"/>
-              </w:rPr>
-              <w:t xml:space="preserve">-key </w:t>
-            </w:r>
-            <w:proofErr w:type="spellStart"/>
-            <w:r>
-              <w:rPr>
-                <w:lang w:val="en-US"/>
-              </w:rPr>
-              <w:t>im</w:t>
-            </w:r>
-            <w:proofErr w:type="spellEnd"/>
-            <w:r>
-              <w:rPr>
-                <w:lang w:val="en-US"/>
-              </w:rPr>
-              <w:t xml:space="preserve"> </w:t>
-            </w:r>
-            <w:proofErr w:type="spellStart"/>
-            <w:r>
-              <w:rPr>
-                <w:lang w:val="en-US"/>
-              </w:rPr>
-              <w:t>Signaturblock</w:t>
-            </w:r>
-            <w:proofErr w:type="spellEnd"/>
+              <w:t>Unterzeichner-key im Signaturblock</w:t>
+            </w:r>
           </w:p>
         </w:tc>
       </w:tr>
@@ -3202,16 +3017,8 @@
               <w:rPr>
                 <w:lang w:val="en-US"/>
               </w:rPr>
-              <w:t>Datum/</w:t>
-            </w:r>
-            <w:proofErr w:type="spellStart"/>
-            <w:r>
-              <w:rPr>
-                <w:lang w:val="en-US"/>
-              </w:rPr>
-              <w:t>Uhrzeit</w:t>
-            </w:r>
-            <w:proofErr w:type="spellEnd"/>
+              <w:t>Datum/Uhrzeit</w:t>
+            </w:r>
           </w:p>
         </w:tc>
         <w:tc>
@@ -3229,21 +3036,7 @@
               <w:rPr>
                 <w:lang w:val="de-DE"/>
               </w:rPr>
-              <w:t>Signaturzeitpunkt-</w:t>
-            </w:r>
-            <w:proofErr w:type="spellStart"/>
-            <w:r>
-              <w:rPr>
-                <w:lang w:val="de-DE"/>
-              </w:rPr>
-              <w:t>key</w:t>
-            </w:r>
-            <w:proofErr w:type="spellEnd"/>
-            <w:r>
-              <w:rPr>
-                <w:lang w:val="de-DE"/>
-              </w:rPr>
-              <w:t xml:space="preserve"> im Signaturblock</w:t>
+              <w:t>Signaturzeitpunkt-key im Signaturblock</w:t>
             </w:r>
           </w:p>
         </w:tc>
@@ -3307,21 +3100,7 @@
               <w:rPr>
                 <w:lang w:val="de-DE"/>
               </w:rPr>
-              <w:t>Ausstellerzertifikat-</w:t>
-            </w:r>
-            <w:proofErr w:type="spellStart"/>
-            <w:r>
-              <w:rPr>
-                <w:lang w:val="de-DE"/>
-              </w:rPr>
-              <w:t>key</w:t>
-            </w:r>
-            <w:proofErr w:type="spellEnd"/>
-            <w:r>
-              <w:rPr>
-                <w:lang w:val="de-DE"/>
-              </w:rPr>
-              <w:t xml:space="preserve"> im Signaturblock</w:t>
+              <w:t>Ausstellerzertifikat-key im Signaturblock</w:t>
             </w:r>
           </w:p>
         </w:tc>
@@ -3385,21 +3164,7 @@
               <w:rPr>
                 <w:lang w:val="de-DE"/>
               </w:rPr>
-              <w:t>Seriennummer-</w:t>
-            </w:r>
-            <w:proofErr w:type="spellStart"/>
-            <w:r>
-              <w:rPr>
-                <w:lang w:val="de-DE"/>
-              </w:rPr>
-              <w:t>key</w:t>
-            </w:r>
-            <w:proofErr w:type="spellEnd"/>
-            <w:r>
-              <w:rPr>
-                <w:lang w:val="de-DE"/>
-              </w:rPr>
-              <w:t xml:space="preserve"> im Signaturblock</w:t>
+              <w:t>Seriennummer-key im Signaturblock</w:t>
             </w:r>
           </w:p>
         </w:tc>
@@ -3440,14 +3205,12 @@
                 <w:lang w:val="de-DE"/>
               </w:rPr>
             </w:pPr>
-            <w:proofErr w:type="spellStart"/>
             <w:r>
               <w:rPr>
                 <w:lang w:val="de-DE"/>
               </w:rPr>
               <w:t>Pruefinformation</w:t>
             </w:r>
-            <w:proofErr w:type="spellEnd"/>
           </w:p>
         </w:tc>
         <w:tc>
@@ -3461,19 +3224,11 @@
                 <w:lang w:val="de-DE"/>
               </w:rPr>
             </w:pPr>
-            <w:proofErr w:type="spellStart"/>
-            <w:r>
-              <w:rPr>
-                <w:lang w:val="de-DE"/>
-              </w:rPr>
-              <w:t>Pruefinformation-key</w:t>
-            </w:r>
-            <w:proofErr w:type="spellEnd"/>
-            <w:r>
-              <w:rPr>
-                <w:lang w:val="de-DE"/>
-              </w:rPr>
-              <w:t xml:space="preserve"> im Signaturblock</w:t>
+            <w:r>
+              <w:rPr>
+                <w:lang w:val="de-DE"/>
+              </w:rPr>
+              <w:t>Pruefinformation-key im Signaturblock</w:t>
             </w:r>
           </w:p>
         </w:tc>
@@ -3537,21 +3292,7 @@
               <w:rPr>
                 <w:lang w:val="de-DE"/>
               </w:rPr>
-              <w:t>Hinweis-</w:t>
-            </w:r>
-            <w:proofErr w:type="spellStart"/>
-            <w:r>
-              <w:rPr>
-                <w:lang w:val="de-DE"/>
-              </w:rPr>
-              <w:t>key</w:t>
-            </w:r>
-            <w:proofErr w:type="spellEnd"/>
-            <w:r>
-              <w:rPr>
-                <w:lang w:val="de-DE"/>
-              </w:rPr>
-              <w:t xml:space="preserve"> im Signaturblock</w:t>
+              <w:t>Hinweis-key im Signaturblock</w:t>
             </w:r>
           </w:p>
         </w:tc>
@@ -3596,39 +3337,7 @@
               <w:rPr>
                 <w:lang w:val="en-US"/>
               </w:rPr>
-              <w:t>${</w:t>
-            </w:r>
-            <w:proofErr w:type="spellStart"/>
-            <w:proofErr w:type="gramStart"/>
-            <w:r>
-              <w:rPr>
-                <w:lang w:val="en-US"/>
-              </w:rPr>
-              <w:t>subject.T</w:t>
-            </w:r>
-            <w:proofErr w:type="spellEnd"/>
-            <w:proofErr w:type="gramEnd"/>
-            <w:r>
-              <w:rPr>
-                <w:lang w:val="en-US"/>
-              </w:rPr>
-              <w:t xml:space="preserve"> != null ? (</w:t>
-            </w:r>
-            <w:proofErr w:type="spellStart"/>
-            <w:proofErr w:type="gramStart"/>
-            <w:r>
-              <w:rPr>
-                <w:lang w:val="en-US"/>
-              </w:rPr>
-              <w:t>subject.T</w:t>
-            </w:r>
-            <w:proofErr w:type="spellEnd"/>
-            <w:proofErr w:type="gramEnd"/>
-            <w:r>
-              <w:rPr>
-                <w:lang w:val="en-US"/>
-              </w:rPr>
-              <w:t xml:space="preserve"> + " ") : ""}${subject.CN}</w:t>
+              <w:t>${subject.T != null ? (subject.T + " ") : ""}${subject.CN}</w:t>
             </w:r>
           </w:p>
         </w:tc>
@@ -3692,39 +3401,7 @@
               <w:rPr>
                 <w:lang w:val="en-US"/>
               </w:rPr>
-              <w:t>${</w:t>
-            </w:r>
-            <w:proofErr w:type="spellStart"/>
-            <w:proofErr w:type="gramStart"/>
-            <w:r>
-              <w:rPr>
-                <w:lang w:val="en-US"/>
-              </w:rPr>
-              <w:t>issuer.T</w:t>
-            </w:r>
-            <w:proofErr w:type="spellEnd"/>
-            <w:proofErr w:type="gramEnd"/>
-            <w:r>
-              <w:rPr>
-                <w:lang w:val="en-US"/>
-              </w:rPr>
-              <w:t xml:space="preserve"> != null ? (</w:t>
-            </w:r>
-            <w:proofErr w:type="spellStart"/>
-            <w:proofErr w:type="gramStart"/>
-            <w:r>
-              <w:rPr>
-                <w:lang w:val="en-US"/>
-              </w:rPr>
-              <w:t>issuer.T</w:t>
-            </w:r>
-            <w:proofErr w:type="spellEnd"/>
-            <w:proofErr w:type="gramEnd"/>
-            <w:r>
-              <w:rPr>
-                <w:lang w:val="en-US"/>
-              </w:rPr>
-              <w:t xml:space="preserve"> + " ") : ""}${issuer.CN}</w:t>
+              <w:t>${issuer.T != null ? (issuer.T + " ") : ""}${issuer.CN}</w:t>
             </w:r>
           </w:p>
         </w:tc>
@@ -3788,21 +3465,7 @@
               <w:rPr>
                 <w:lang w:val="de-DE"/>
               </w:rPr>
-              <w:t>${</w:t>
-            </w:r>
-            <w:proofErr w:type="spellStart"/>
-            <w:r>
-              <w:rPr>
-                <w:lang w:val="de-DE"/>
-              </w:rPr>
-              <w:t>sn</w:t>
-            </w:r>
-            <w:proofErr w:type="spellEnd"/>
-            <w:r>
-              <w:rPr>
-                <w:lang w:val="de-DE"/>
-              </w:rPr>
-              <w:t>}</w:t>
+              <w:t>${sn}</w:t>
             </w:r>
           </w:p>
         </w:tc>
@@ -3866,16 +3529,8 @@
               <w:rPr>
                 <w:lang w:val="de-DE"/>
               </w:rPr>
-              <w:t>Verifikation unter</w:t>
-            </w:r>
-            <w:proofErr w:type="gramStart"/>
-            <w:r>
-              <w:rPr>
-                <w:lang w:val="de-DE"/>
-              </w:rPr>
-              <w:t xml:space="preserve"> ….</w:t>
-            </w:r>
-            <w:proofErr w:type="gramEnd"/>
+              <w:t>Verifikation unter ….</w:t>
+            </w:r>
           </w:p>
         </w:tc>
         <w:tc>
@@ -3934,33 +3589,11 @@
                 <w:lang w:val="de-DE"/>
               </w:rPr>
             </w:pPr>
-            <w:proofErr w:type="spellStart"/>
-            <w:r>
-              <w:rPr>
-                <w:lang w:val="de-DE"/>
-              </w:rPr>
-              <w:t>Equivalent</w:t>
-            </w:r>
-            <w:proofErr w:type="spellEnd"/>
-            <w:r>
-              <w:rPr>
-                <w:lang w:val="de-DE"/>
-              </w:rPr>
-              <w:t xml:space="preserve"> zu </w:t>
-            </w:r>
-            <w:proofErr w:type="spellStart"/>
-            <w:r>
-              <w:rPr>
-                <w:lang w:val="de-DE"/>
-              </w:rPr>
-              <w:t>hanschschr</w:t>
-            </w:r>
-            <w:proofErr w:type="spellEnd"/>
-            <w:r>
-              <w:rPr>
-                <w:lang w:val="de-DE"/>
-              </w:rPr>
-              <w:t>. Signatur</w:t>
+            <w:r>
+              <w:rPr>
+                <w:lang w:val="de-DE"/>
+              </w:rPr>
+              <w:t>Equivalent zu hanschschr. Signatur</w:t>
             </w:r>
           </w:p>
         </w:tc>
@@ -4024,21 +3657,7 @@
               <w:rPr>
                 <w:lang w:val="de-DE"/>
               </w:rPr>
-              <w:t>x:40.</w:t>
-            </w:r>
-            <w:proofErr w:type="gramStart"/>
-            <w:r>
-              <w:rPr>
-                <w:lang w:val="de-DE"/>
-              </w:rPr>
-              <w:t>0;y</w:t>
-            </w:r>
-            <w:proofErr w:type="gramEnd"/>
-            <w:r>
-              <w:rPr>
-                <w:lang w:val="de-DE"/>
-              </w:rPr>
-              <w:t>:800.0;w:400.0;f:80</w:t>
+              <w:t>x:40.0;y:800.0;w:400.0;f:80</w:t>
             </w:r>
           </w:p>
         </w:tc>
@@ -4083,7 +3702,6 @@
               <w:rPr>
                 <w:lang w:val="de-DE"/>
               </w:rPr>
-              <w:lastRenderedPageBreak/>
               <w:t>.adobeSignReasonValue</w:t>
             </w:r>
           </w:p>
@@ -4099,19 +3717,11 @@
                 <w:lang w:val="de-DE"/>
               </w:rPr>
             </w:pPr>
-            <w:proofErr w:type="spellStart"/>
-            <w:r>
-              <w:rPr>
-                <w:lang w:val="de-DE"/>
-              </w:rPr>
-              <w:t>Signaturpruefung</w:t>
-            </w:r>
-            <w:proofErr w:type="spellEnd"/>
-            <w:r>
-              <w:rPr>
-                <w:lang w:val="de-DE"/>
-              </w:rPr>
-              <w:t xml:space="preserve"> unte</w:t>
+            <w:r>
+              <w:rPr>
+                <w:lang w:val="de-DE"/>
+              </w:rPr>
+              <w:t>Signaturpruefung unte</w:t>
             </w:r>
             <w:r>
               <w:rPr>
@@ -4136,21 +3746,7 @@
               <w:rPr>
                 <w:lang w:val="de-DE"/>
               </w:rPr>
-              <w:t>Text, der im Adobe Reader unter "</w:t>
-            </w:r>
-            <w:proofErr w:type="spellStart"/>
-            <w:r>
-              <w:rPr>
-                <w:lang w:val="de-DE"/>
-              </w:rPr>
-              <w:t>Reason</w:t>
-            </w:r>
-            <w:proofErr w:type="spellEnd"/>
-            <w:r>
-              <w:rPr>
-                <w:lang w:val="de-DE"/>
-              </w:rPr>
-              <w:t>" angezeigt wird.</w:t>
+              <w:t>Text, der im Adobe Reader unter "Reason" angezeigt wird.</w:t>
             </w:r>
           </w:p>
         </w:tc>
@@ -4176,7 +3772,7 @@
               <w:rPr>
                 <w:lang w:val="de-DE"/>
               </w:rPr>
-              <w:t>.adobeSignFieldValue</w:t>
+              <w:t>.value.SIG_LABEL</w:t>
             </w:r>
           </w:p>
         </w:tc>
@@ -4188,14 +3784,14 @@
             <w:pPr>
               <w:pStyle w:val="Value"/>
               <w:rPr>
-                <w:lang w:val="de-DE"/>
-              </w:rPr>
-            </w:pPr>
-            <w:r>
-              <w:rPr>
-                <w:lang w:val="de-DE"/>
-              </w:rPr>
-              <w:t>PDF-AS Signatur</w:t>
+                <w:lang w:val="en-US"/>
+              </w:rPr>
+            </w:pPr>
+            <w:r>
+              <w:rPr>
+                <w:lang w:val="en-US"/>
+              </w:rPr>
+              <w:t>./images/signatur-logo_de.png</w:t>
             </w:r>
           </w:p>
         </w:tc>
@@ -4207,143 +3803,6 @@
             <w:pPr>
               <w:pStyle w:val="Beschreibung"/>
               <w:rPr>
-                <w:lang w:val="de-DE"/>
-              </w:rPr>
-            </w:pPr>
-            <w:r>
-              <w:rPr>
-                <w:lang w:val="de-DE"/>
-              </w:rPr>
-              <w:t xml:space="preserve">Alternativer Text für den Signaturblock welcher </w:t>
-            </w:r>
-            <w:proofErr w:type="spellStart"/>
-            <w:r>
-              <w:rPr>
-                <w:lang w:val="de-DE"/>
-              </w:rPr>
-              <w:t>z.b.</w:t>
-            </w:r>
-            <w:proofErr w:type="spellEnd"/>
-            <w:r>
-              <w:rPr>
-                <w:lang w:val="de-DE"/>
-              </w:rPr>
-              <w:t xml:space="preserve"> von </w:t>
-            </w:r>
-            <w:proofErr w:type="spellStart"/>
-            <w:r>
-              <w:rPr>
-                <w:lang w:val="de-DE"/>
-              </w:rPr>
-              <w:t>Screenreadern</w:t>
-            </w:r>
-            <w:proofErr w:type="spellEnd"/>
-            <w:r>
-              <w:rPr>
-                <w:lang w:val="de-DE"/>
-              </w:rPr>
-              <w:t xml:space="preserve"> verwendet wird.</w:t>
-            </w:r>
-          </w:p>
-        </w:tc>
-      </w:tr>
-      <w:tr>
-        <w:trPr>
-          <w:cantSplit/>
-          <w:jc w:val="center"/>
-        </w:trPr>
-        <w:tc>
-          <w:tcPr>
-            <w:tcW w:w="2151" w:type="dxa"/>
-          </w:tcPr>
-          <w:p>
-            <w:pPr>
-              <w:pStyle w:val="Property"/>
-              <w:ind w:left="0"/>
-              <w:rPr>
-                <w:lang w:val="de-DE"/>
-              </w:rPr>
-            </w:pPr>
-            <w:r>
-              <w:rPr>
-                <w:lang w:val="de-DE"/>
-              </w:rPr>
-              <w:t>.sigLogoAltText</w:t>
-            </w:r>
-          </w:p>
-        </w:tc>
-        <w:tc>
-          <w:tcPr>
-            <w:tcW w:w="2239" w:type="dxa"/>
-          </w:tcPr>
-          <w:p>
-            <w:pPr>
-              <w:pStyle w:val="Value"/>
-              <w:rPr>
-                <w:lang w:val="de-DE"/>
-              </w:rPr>
-            </w:pPr>
-            <w:r>
-              <w:rPr>
-                <w:lang w:val="de-DE"/>
-              </w:rPr>
-              <w:t>Bildmarke</w:t>
-            </w:r>
-          </w:p>
-        </w:tc>
-        <w:tc>
-          <w:tcPr>
-            <w:tcW w:w="4682" w:type="dxa"/>
-          </w:tcPr>
-          <w:p>
-            <w:pPr>
-              <w:pStyle w:val="Beschreibung"/>
-              <w:rPr>
-                <w:lang w:val="de-DE"/>
-              </w:rPr>
-            </w:pPr>
-            <w:r>
-              <w:rPr>
-                <w:lang w:val="de-DE"/>
-              </w:rPr>
-              <w:t>Alternative Text für das Logo im Signaturblock</w:t>
-            </w:r>
-          </w:p>
-        </w:tc>
-      </w:tr>
-      <w:tr>
-        <w:trPr>
-          <w:cantSplit/>
-          <w:jc w:val="center"/>
-        </w:trPr>
-        <w:tc>
-          <w:tcPr>
-            <w:tcW w:w="2151" w:type="dxa"/>
-          </w:tcPr>
-          <w:p>
-            <w:pPr>
-              <w:pStyle w:val="Property"/>
-              <w:ind w:left="0"/>
-              <w:rPr>
-                <w:lang w:val="de-DE"/>
-              </w:rPr>
-            </w:pPr>
-            <w:r>
-              <w:rPr>
-                <w:lang w:val="de-DE"/>
-              </w:rPr>
-              <w:t>.value.SIG_LABEL</w:t>
-            </w:r>
-          </w:p>
-        </w:tc>
-        <w:tc>
-          <w:tcPr>
-            <w:tcW w:w="2239" w:type="dxa"/>
-          </w:tcPr>
-          <w:p>
-            <w:pPr>
-              <w:pStyle w:val="Value"/>
-              <w:rPr>
                 <w:lang w:val="en-US"/>
               </w:rPr>
             </w:pPr>
@@ -4351,54 +3810,7 @@
               <w:rPr>
                 <w:lang w:val="en-US"/>
               </w:rPr>
-              <w:t>./images/signatur-logo_de.png</w:t>
-            </w:r>
-          </w:p>
-        </w:tc>
-        <w:tc>
-          <w:tcPr>
-            <w:tcW w:w="4682" w:type="dxa"/>
-          </w:tcPr>
-          <w:p>
-            <w:pPr>
-              <w:pStyle w:val="Beschreibung"/>
-              <w:rPr>
-                <w:lang w:val="en-US"/>
-              </w:rPr>
-            </w:pPr>
-            <w:r>
-              <w:rPr>
-                <w:lang w:val="en-US"/>
-              </w:rPr>
-              <w:t xml:space="preserve">Link </w:t>
-            </w:r>
-            <w:proofErr w:type="spellStart"/>
-            <w:r>
-              <w:rPr>
-                <w:lang w:val="en-US"/>
-              </w:rPr>
-              <w:t>zum</w:t>
-            </w:r>
-            <w:proofErr w:type="spellEnd"/>
-            <w:r>
-              <w:rPr>
-                <w:lang w:val="en-US"/>
-              </w:rPr>
-              <w:t xml:space="preserve"> </w:t>
-            </w:r>
-            <w:proofErr w:type="spellStart"/>
-            <w:r>
-              <w:rPr>
-                <w:lang w:val="en-US"/>
-              </w:rPr>
-              <w:t>Signaturlogo</w:t>
-            </w:r>
-            <w:proofErr w:type="spellEnd"/>
-            <w:r>
-              <w:rPr>
-                <w:lang w:val="en-US"/>
-              </w:rPr>
-              <w:t xml:space="preserve">. </w:t>
+              <w:t xml:space="preserve">Link zum Signaturlogo. </w:t>
             </w:r>
           </w:p>
         </w:tc>
@@ -4406,34 +3818,11 @@
     </w:tbl>
     <w:p>
       <w:r>
+        <w:lastRenderedPageBreak/>
         <w:br/>
       </w:r>
       <w:r>
-        <w:t>Zusätzlich zu den dynamischen Werten aus den Zertifikatsdaten können selbstdefinierte Parameter im Zuge der Signaturerstellung an PDF-AS übergeben werden. Auf diese Parameter kann im Signaturblock mittels ${</w:t>
-      </w:r>
-      <w:proofErr w:type="spellStart"/>
-      <w:r>
-        <w:t>sbp.xyz</w:t>
-      </w:r>
-      <w:proofErr w:type="spellEnd"/>
-      <w:r>
-        <w:t>} zugegriffen werden. Dabei handelt es sich bei „</w:t>
-      </w:r>
-      <w:proofErr w:type="spellStart"/>
-      <w:r>
-        <w:t>sbp</w:t>
-      </w:r>
-      <w:proofErr w:type="spellEnd"/>
-      <w:r>
-        <w:t>“ um eine Konstante und bei „</w:t>
-      </w:r>
-      <w:proofErr w:type="spellStart"/>
-      <w:r>
-        <w:t>xyz</w:t>
-      </w:r>
-      <w:proofErr w:type="spellEnd"/>
-      <w:r>
-        <w:t>“ um einen frei</w:t>
+        <w:t>Zusätzlich zu den dynamischen Werten aus den Zertifikatsdaten können selbstdefinierte Parameter im Zuge der Signaturerstellung an PDF-AS übergeben werden. Auf diese Parameter kann im Signaturblock mittels ${sbp.xyz} zugegriffen werden. Dabei handelt es sich bei „sbp“ um eine Konstante und bei „xyz“ um einen frei</w:t>
       </w:r>
       <w:r>
         <w:rPr>
@@ -4462,31 +3851,7 @@
         <w:t>definiert.</w:t>
       </w:r>
       <w:r>
-        <w:t xml:space="preserve"> &lt;</w:t>
-      </w:r>
-      <w:proofErr w:type="spellStart"/>
-      <w:r>
-        <w:t>TableName</w:t>
-      </w:r>
-      <w:proofErr w:type="spellEnd"/>
-      <w:r>
-        <w:t xml:space="preserve">&gt; wird dabei durch den eigentlichen Tabellennamen, </w:t>
-      </w:r>
-      <w:proofErr w:type="spellStart"/>
-      <w:r>
-        <w:t>zb</w:t>
-      </w:r>
-      <w:proofErr w:type="spellEnd"/>
-      <w:r>
-        <w:t xml:space="preserve"> </w:t>
-      </w:r>
-      <w:proofErr w:type="spellStart"/>
-      <w:r>
-        <w:t>main</w:t>
-      </w:r>
-      <w:proofErr w:type="spellEnd"/>
-      <w:r>
-        <w:t>, ersetzt.</w:t>
+        <w:t xml:space="preserve"> &lt;TableName&gt; wird dabei durch den eigentlichen Tabellennamen, zb main, ersetzt.</w:t>
       </w:r>
     </w:p>
     <w:tbl>
@@ -4638,19 +4003,11 @@
                 <w:lang w:val="de-DE"/>
               </w:rPr>
             </w:pPr>
-            <w:proofErr w:type="spellStart"/>
-            <w:r>
-              <w:rPr>
-                <w:lang w:val="de-DE"/>
-              </w:rPr>
-              <w:t>SIG_LABEL-i|TABLE-info</w:t>
-            </w:r>
-            <w:proofErr w:type="spellEnd"/>
-            <w:r>
-              <w:rPr>
-                <w:lang w:val="de-DE"/>
-              </w:rPr>
-              <w:t xml:space="preserve"> (Erklärung siehe unten)</w:t>
+            <w:r>
+              <w:rPr>
+                <w:lang w:val="de-DE"/>
+              </w:rPr>
+              <w:t>SIG_LABEL-i|TABLE-info (Erklärung siehe unten)</w:t>
             </w:r>
           </w:p>
         </w:tc>
@@ -4669,21 +4026,7 @@
               <w:rPr>
                 <w:lang w:val="de-DE"/>
               </w:rPr>
-              <w:t>Definiert den Inhalt der n-</w:t>
-            </w:r>
-            <w:proofErr w:type="spellStart"/>
-            <w:r>
-              <w:rPr>
-                <w:lang w:val="de-DE"/>
-              </w:rPr>
-              <w:t>ten</w:t>
-            </w:r>
-            <w:proofErr w:type="spellEnd"/>
-            <w:r>
-              <w:rPr>
-                <w:lang w:val="de-DE"/>
-              </w:rPr>
-              <w:t xml:space="preserve"> Zeile im Signaturblock. </w:t>
+              <w:t xml:space="preserve">Definiert den Inhalt der n-ten Zeile im Signaturblock. </w:t>
             </w:r>
           </w:p>
         </w:tc>
@@ -4868,19 +4211,11 @@
                 <w:lang w:val="de-DE"/>
               </w:rPr>
             </w:pPr>
-            <w:proofErr w:type="spellStart"/>
-            <w:r>
-              <w:rPr>
-                <w:lang w:val="de-DE"/>
-              </w:rPr>
-              <w:t>Padding</w:t>
-            </w:r>
-            <w:proofErr w:type="spellEnd"/>
-            <w:r>
-              <w:rPr>
-                <w:lang w:val="de-DE"/>
-              </w:rPr>
-              <w:t xml:space="preserve"> in der </w:t>
+            <w:r>
+              <w:rPr>
+                <w:lang w:val="de-DE"/>
+              </w:rPr>
+              <w:t xml:space="preserve">Padding in der </w:t>
             </w:r>
             <w:r>
               <w:rPr>
@@ -4980,7 +4315,6 @@
               <w:rPr>
                 <w:lang w:val="en-US"/>
               </w:rPr>
-              <w:lastRenderedPageBreak/>
               <w:t>.table.</w:t>
             </w:r>
             <w:r>
@@ -5093,16 +4427,8 @@
               <w:rPr>
                 <w:lang w:val="en-US"/>
               </w:rPr>
-              <w:t>HELVETICA,</w:t>
-            </w:r>
-            <w:proofErr w:type="gramStart"/>
-            <w:r>
-              <w:rPr>
-                <w:lang w:val="en-US"/>
-              </w:rPr>
-              <w:t>8,BOLD</w:t>
-            </w:r>
-            <w:proofErr w:type="gramEnd"/>
+              <w:t>HELVETICA,8,BOLD</w:t>
+            </w:r>
           </w:p>
         </w:tc>
         <w:tc>
@@ -5176,16 +4502,8 @@
               <w:rPr>
                 <w:lang w:val="de-DE"/>
               </w:rPr>
-              <w:t>COURIER,</w:t>
-            </w:r>
-            <w:proofErr w:type="gramStart"/>
-            <w:r>
-              <w:rPr>
-                <w:lang w:val="de-DE"/>
-              </w:rPr>
-              <w:t>8,NORMAL</w:t>
-            </w:r>
-            <w:proofErr w:type="gramEnd"/>
+              <w:t>COURIER,8,NORMAL</w:t>
+            </w:r>
           </w:p>
         </w:tc>
         <w:tc>
@@ -5457,19 +4775,11 @@
                 <w:lang w:val="de-DE"/>
               </w:rPr>
             </w:pPr>
-            <w:proofErr w:type="gramStart"/>
-            <w:r>
-              <w:rPr>
-                <w:lang w:val="de-DE"/>
-              </w:rPr>
-              <w:t>.table</w:t>
-            </w:r>
-            <w:proofErr w:type="gramEnd"/>
-            <w:r>
-              <w:rPr>
-                <w:lang w:val="de-DE"/>
-              </w:rPr>
-              <w:t>.main.1=TABLE-info</w:t>
+            <w:r>
+              <w:rPr>
+                <w:lang w:val="de-DE"/>
+              </w:rPr>
+              <w:t>.table.main.1=TABLE-info</w:t>
             </w:r>
           </w:p>
         </w:tc>
@@ -5488,63 +4798,7 @@
               <w:rPr>
                 <w:lang w:val="de-DE"/>
               </w:rPr>
-              <w:t xml:space="preserve">Hier wird die Tabelle </w:t>
-            </w:r>
-            <w:proofErr w:type="spellStart"/>
-            <w:r>
-              <w:rPr>
-                <w:lang w:val="de-DE"/>
-              </w:rPr>
-              <w:t>info</w:t>
-            </w:r>
-            <w:proofErr w:type="spellEnd"/>
-            <w:r>
-              <w:rPr>
-                <w:lang w:val="de-DE"/>
-              </w:rPr>
-              <w:t xml:space="preserve"> in die 1.Zeile der Tabelle </w:t>
-            </w:r>
-            <w:proofErr w:type="spellStart"/>
-            <w:r>
-              <w:rPr>
-                <w:lang w:val="de-DE"/>
-              </w:rPr>
-              <w:t>main</w:t>
-            </w:r>
-            <w:proofErr w:type="spellEnd"/>
-            <w:r>
-              <w:rPr>
-                <w:lang w:val="de-DE"/>
-              </w:rPr>
-              <w:t xml:space="preserve"> eingebettet. Die Tabellen </w:t>
-            </w:r>
-            <w:proofErr w:type="spellStart"/>
-            <w:r>
-              <w:rPr>
-                <w:lang w:val="de-DE"/>
-              </w:rPr>
-              <w:t>main</w:t>
-            </w:r>
-            <w:proofErr w:type="spellEnd"/>
-            <w:r>
-              <w:rPr>
-                <w:lang w:val="de-DE"/>
-              </w:rPr>
-              <w:t xml:space="preserve"> und </w:t>
-            </w:r>
-            <w:proofErr w:type="spellStart"/>
-            <w:r>
-              <w:rPr>
-                <w:lang w:val="de-DE"/>
-              </w:rPr>
-              <w:t>info</w:t>
-            </w:r>
-            <w:proofErr w:type="spellEnd"/>
-            <w:r>
-              <w:rPr>
-                <w:lang w:val="de-DE"/>
-              </w:rPr>
-              <w:t xml:space="preserve"> müssen im Profil definiert sein. </w:t>
+              <w:t xml:space="preserve">Hier wird die Tabelle info in die 1.Zeile der Tabelle main eingebettet. Die Tabellen main und info müssen im Profil definiert sein. </w:t>
             </w:r>
           </w:p>
         </w:tc>
@@ -5584,28 +4838,12 @@
                 <w:lang w:val="en-US"/>
               </w:rPr>
             </w:pPr>
-            <w:proofErr w:type="gramStart"/>
             <w:r>
               <w:rPr>
                 <w:lang w:val="en-US"/>
               </w:rPr>
-              <w:t>.table</w:t>
-            </w:r>
-            <w:proofErr w:type="gramEnd"/>
-            <w:r>
-              <w:rPr>
-                <w:lang w:val="en-US"/>
-              </w:rPr>
-              <w:t>.main.2=SIG_LABEL-</w:t>
-            </w:r>
-            <w:proofErr w:type="spellStart"/>
-            <w:r>
-              <w:rPr>
-                <w:lang w:val="en-US"/>
-              </w:rPr>
-              <w:t>i</w:t>
-            </w:r>
-            <w:proofErr w:type="spellEnd"/>
+              <w:t>.table.main.2=SIG_LABEL-i</w:t>
+            </w:r>
           </w:p>
         </w:tc>
         <w:tc>
@@ -5623,30 +4861,14 @@
               <w:rPr>
                 <w:lang w:val="de-DE"/>
               </w:rPr>
-              <w:t xml:space="preserve">Der </w:t>
-            </w:r>
-            <w:proofErr w:type="gramStart"/>
-            <w:r>
-              <w:rPr>
-                <w:lang w:val="de-DE"/>
-              </w:rPr>
-              <w:t xml:space="preserve">Wert </w:t>
-            </w:r>
-            <w:r>
-              <w:rPr>
-                <w:lang w:val="de-DE"/>
-              </w:rPr>
-              <w:t>.</w:t>
-            </w:r>
-            <w:proofErr w:type="spellStart"/>
-            <w:proofErr w:type="gramEnd"/>
-            <w:r>
-              <w:rPr>
-                <w:lang w:val="de-DE"/>
-              </w:rPr>
-              <w:t>value.SIG_LABEL</w:t>
-            </w:r>
-            <w:proofErr w:type="spellEnd"/>
+              <w:t xml:space="preserve">Der Wert </w:t>
+            </w:r>
+            <w:r>
+              <w:rPr>
+                <w:lang w:val="de-DE"/>
+              </w:rPr>
+              <w:t>.value.SIG_LABEL</w:t>
+            </w:r>
             <w:r>
               <w:rPr>
                 <w:lang w:val="de-DE"/>
@@ -5691,19 +4913,11 @@
                 <w:lang w:val="en-US"/>
               </w:rPr>
             </w:pPr>
-            <w:proofErr w:type="gramStart"/>
             <w:r>
               <w:rPr>
                 <w:lang w:val="en-US"/>
               </w:rPr>
-              <w:t>.table.info</w:t>
-            </w:r>
-            <w:proofErr w:type="gramEnd"/>
-            <w:r>
-              <w:rPr>
-                <w:lang w:val="en-US"/>
-              </w:rPr>
-              <w:t>.1=SIG_SUBJECT-c</w:t>
+              <w:t>.table.info.1=SIG_SUBJECT-c</w:t>
             </w:r>
           </w:p>
         </w:tc>
@@ -5734,43 +4948,7 @@
               <w:rPr>
                 <w:lang w:val="de-DE"/>
               </w:rPr>
-              <w:t xml:space="preserve">an, dass der Bezeichner, der </w:t>
-            </w:r>
-            <w:proofErr w:type="spellStart"/>
-            <w:r>
-              <w:rPr>
-                <w:lang w:val="de-DE"/>
-              </w:rPr>
-              <w:t>z.b.</w:t>
-            </w:r>
-            <w:proofErr w:type="spellEnd"/>
-            <w:r>
-              <w:rPr>
-                <w:lang w:val="de-DE"/>
-              </w:rPr>
-              <w:t xml:space="preserve"> </w:t>
-            </w:r>
-            <w:proofErr w:type="gramStart"/>
-            <w:r>
-              <w:rPr>
-                <w:lang w:val="de-DE"/>
-              </w:rPr>
-              <w:t>über .</w:t>
-            </w:r>
-            <w:proofErr w:type="spellStart"/>
-            <w:proofErr w:type="gramEnd"/>
-            <w:r>
-              <w:rPr>
-                <w:lang w:val="de-DE"/>
-              </w:rPr>
-              <w:t>key.SIG_SUBJECT</w:t>
-            </w:r>
-            <w:proofErr w:type="spellEnd"/>
-            <w:r>
-              <w:rPr>
-                <w:lang w:val="de-DE"/>
-              </w:rPr>
-              <w:t xml:space="preserve"> zuvor definiert wurde, in das entsprechende Feld eingetragen wird.</w:t>
+              <w:t>an, dass der Bezeichner, der z.b. über .key.SIG_SUBJECT zuvor definiert wurde, in das entsprechende Feld eingetragen wird.</w:t>
             </w:r>
           </w:p>
         </w:tc>
@@ -5807,19 +4985,11 @@
                 <w:lang w:val="en-US"/>
               </w:rPr>
             </w:pPr>
-            <w:proofErr w:type="gramStart"/>
             <w:r>
               <w:rPr>
                 <w:lang w:val="en-US"/>
               </w:rPr>
-              <w:t>.table.info</w:t>
-            </w:r>
-            <w:proofErr w:type="gramEnd"/>
-            <w:r>
-              <w:rPr>
-                <w:lang w:val="en-US"/>
-              </w:rPr>
-              <w:t>.1=SIG_SUBJECT-v</w:t>
+              <w:t>.table.info.1=SIG_SUBJECT-v</w:t>
             </w:r>
           </w:p>
         </w:tc>
@@ -5856,43 +5026,7 @@
               <w:rPr>
                 <w:lang w:val="de-DE"/>
               </w:rPr>
-              <w:t xml:space="preserve">an, dass der Wert, der </w:t>
-            </w:r>
-            <w:proofErr w:type="spellStart"/>
-            <w:r>
-              <w:rPr>
-                <w:lang w:val="de-DE"/>
-              </w:rPr>
-              <w:t>z.b.</w:t>
-            </w:r>
-            <w:proofErr w:type="spellEnd"/>
-            <w:r>
-              <w:rPr>
-                <w:lang w:val="de-DE"/>
-              </w:rPr>
-              <w:t xml:space="preserve"> </w:t>
-            </w:r>
-            <w:proofErr w:type="gramStart"/>
-            <w:r>
-              <w:rPr>
-                <w:lang w:val="de-DE"/>
-              </w:rPr>
-              <w:t>über .</w:t>
-            </w:r>
-            <w:proofErr w:type="spellStart"/>
-            <w:proofErr w:type="gramEnd"/>
-            <w:r>
-              <w:rPr>
-                <w:lang w:val="de-DE"/>
-              </w:rPr>
-              <w:t>value.SIG_SUBJECT</w:t>
-            </w:r>
-            <w:proofErr w:type="spellEnd"/>
-            <w:r>
-              <w:rPr>
-                <w:lang w:val="de-DE"/>
-              </w:rPr>
-              <w:t xml:space="preserve"> zuvor definiert wurde, in das entsprechende Feld eingetragen wird.</w:t>
+              <w:t>an, dass der Wert, der z.b. über .value.SIG_SUBJECT zuvor definiert wurde, in das entsprechende Feld eingetragen wird.</w:t>
             </w:r>
           </w:p>
         </w:tc>
@@ -5926,19 +5060,11 @@
                 <w:lang w:val="en-US"/>
               </w:rPr>
             </w:pPr>
-            <w:proofErr w:type="gramStart"/>
             <w:r>
               <w:rPr>
                 <w:lang w:val="en-US"/>
               </w:rPr>
-              <w:t>.table.info</w:t>
-            </w:r>
-            <w:proofErr w:type="gramEnd"/>
-            <w:r>
-              <w:rPr>
-                <w:lang w:val="en-US"/>
-              </w:rPr>
-              <w:t>.1=SIG_SUBJECT-cv</w:t>
+              <w:t>.table.info.1=SIG_SUBJECT-cv</w:t>
             </w:r>
           </w:p>
         </w:tc>
@@ -5974,9 +5100,8 @@
       <w:pPr>
         <w:pStyle w:val="Heading2"/>
       </w:pPr>
-      <w:bookmarkStart w:id="9" w:name="_Toc417992176"/>
-      <w:r>
-        <w:lastRenderedPageBreak/>
+      <w:bookmarkStart w:id="9" w:name="_Toc229414986"/>
+      <w:r>
         <w:t>Spezielle Parameter</w:t>
       </w:r>
       <w:bookmarkEnd w:id="9"/>
@@ -6138,28 +5263,18 @@
                 <w:lang w:val="de-DE"/>
               </w:rPr>
             </w:pPr>
-            <w:proofErr w:type="spellStart"/>
             <w:r>
               <w:rPr>
                 <w:lang w:val="de-DE"/>
               </w:rPr>
               <w:t>true</w:t>
             </w:r>
-            <w:proofErr w:type="spellEnd"/>
-            <w:r>
-              <w:rPr>
-                <w:lang w:val="de-DE"/>
-              </w:rPr>
-              <w:t>/</w:t>
-            </w:r>
-            <w:proofErr w:type="spellStart"/>
-            <w:r>
-              <w:rPr>
-                <w:lang w:val="de-DE"/>
-              </w:rPr>
-              <w:t>false</w:t>
-            </w:r>
-            <w:proofErr w:type="spellEnd"/>
+            <w:r>
+              <w:rPr>
+                <w:lang w:val="de-DE"/>
+              </w:rPr>
+              <w:t>/false</w:t>
+            </w:r>
           </w:p>
         </w:tc>
         <w:tc>
@@ -6209,7 +5324,6 @@
                 <w:lang w:val="de-DE"/>
               </w:rPr>
             </w:pPr>
-            <w:proofErr w:type="spellStart"/>
             <w:r>
               <w:rPr>
                 <w:b/>
@@ -6218,7 +5332,6 @@
               </w:rPr>
               <w:t>Deprecated</w:t>
             </w:r>
-            <w:proofErr w:type="spellEnd"/>
             <w:r>
               <w:rPr>
                 <w:b/>
@@ -6250,6 +5363,7 @@
               <w:rPr>
                 <w:lang w:val="en-US"/>
               </w:rPr>
+              <w:lastRenderedPageBreak/>
               <w:t>sig_obj.</w:t>
             </w:r>
             <w:r>
@@ -6296,19 +5410,11 @@
                 <w:lang w:val="de-DE"/>
               </w:rPr>
             </w:pPr>
-            <w:proofErr w:type="spellStart"/>
-            <w:r>
-              <w:rPr>
-                <w:lang w:val="de-DE"/>
-              </w:rPr>
-              <w:t>false</w:t>
-            </w:r>
-            <w:proofErr w:type="spellEnd"/>
-            <w:r>
-              <w:rPr>
-                <w:lang w:val="de-DE"/>
-              </w:rPr>
-              <w:t>: Es wird immer ver</w:t>
+            <w:r>
+              <w:rPr>
+                <w:lang w:val="de-DE"/>
+              </w:rPr>
+              <w:t>false: Es wird immer ver</w:t>
             </w:r>
             <w:r>
               <w:rPr>
@@ -6324,19 +5430,11 @@
                 <w:lang w:val="de-DE"/>
               </w:rPr>
             </w:pPr>
-            <w:proofErr w:type="spellStart"/>
-            <w:r>
-              <w:rPr>
-                <w:lang w:val="de-DE"/>
-              </w:rPr>
-              <w:t>true</w:t>
-            </w:r>
-            <w:proofErr w:type="spellEnd"/>
-            <w:r>
-              <w:rPr>
-                <w:lang w:val="de-DE"/>
-              </w:rPr>
-              <w:t>: Es wird ebenfalls versucht die notwendigen Informationen zu schreiben, falls dies aber misslingt, da es sich nicht um ein PDF-UA konformes Dokument handelt, wird der Signaturvorgang mit einem Fehler abgebrochen.</w:t>
+            <w:r>
+              <w:rPr>
+                <w:lang w:val="de-DE"/>
+              </w:rPr>
+              <w:t>true: Es wird ebenfalls versucht die notwendigen Informationen zu schreiben, falls dies aber misslingt, da es sich nicht um ein PDF-UA konformes Dokument handelt, wird der Signaturvorgang mit einem Fehler abgebrochen.</w:t>
             </w:r>
           </w:p>
         </w:tc>
@@ -6428,7 +5526,7 @@
       <w:pPr>
         <w:pStyle w:val="Heading1"/>
       </w:pPr>
-      <w:bookmarkStart w:id="10" w:name="_Toc417992177"/>
+      <w:bookmarkStart w:id="10" w:name="_Toc229414987"/>
       <w:r>
         <w:lastRenderedPageBreak/>
         <w:t>Beispiele</w:t>
@@ -6447,7 +5545,7 @@
       <w:pPr>
         <w:pStyle w:val="Heading2"/>
       </w:pPr>
-      <w:bookmarkStart w:id="11" w:name="_Toc417992178"/>
+      <w:bookmarkStart w:id="11" w:name="_Toc229414988"/>
       <w:r>
         <w:t>Simple Tabelle</w:t>
       </w:r>
@@ -6498,31 +5596,7 @@
     </w:p>
     <w:p>
       <w:r>
-        <w:t>Hierbei handelt es sich um die Basis für einen Signaturblock. Die Tabelle enthält lediglich den Namen des Unterzeichners, in diesem Fall ‘</w:t>
-      </w:r>
-      <w:proofErr w:type="spellStart"/>
-      <w:r>
-        <w:t>test</w:t>
-      </w:r>
-      <w:proofErr w:type="spellEnd"/>
-      <w:r>
-        <w:t xml:space="preserve">‘. Hier wird zuerst der Name aus dem Zertifikat extrahiert und sowohl </w:t>
-      </w:r>
-      <w:proofErr w:type="spellStart"/>
-      <w:r>
-        <w:t>key</w:t>
-      </w:r>
-      <w:proofErr w:type="spellEnd"/>
-      <w:r>
-        <w:t xml:space="preserve"> als auch </w:t>
-      </w:r>
-      <w:proofErr w:type="spellStart"/>
-      <w:r>
-        <w:t>value</w:t>
-      </w:r>
-      <w:proofErr w:type="spellEnd"/>
-      <w:r>
-        <w:t xml:space="preserve"> zugewiesen. Dieser Wert wir dann über die Anweisung ‚‘SIG_SUBJECT-cv‘ in die Tabelle eingetragen. Der Rest der Parameter ist für die visuelle Repräsentation des Blocks vorgesehen. </w:t>
+        <w:t xml:space="preserve">Hierbei handelt es sich um die Basis für einen Signaturblock. Die Tabelle enthält lediglich den Namen des Unterzeichners, in diesem Fall ‘test‘. Hier wird zuerst der Name aus dem Zertifikat extrahiert und sowohl key als auch value zugewiesen. Dieser Wert wir dann über die Anweisung ‚‘SIG_SUBJECT-cv‘ in die Tabelle eingetragen. Der Rest der Parameter ist für die visuelle Repräsentation des Blocks vorgesehen. </w:t>
       </w:r>
     </w:p>
     <w:p>
@@ -6550,45 +5624,13 @@
         <w:rPr>
           <w:lang w:val="en-US"/>
         </w:rPr>
-        <w:t>ORMAL_1.value.SIG_SUBJECT=${</w:t>
-      </w:r>
-      <w:proofErr w:type="spellStart"/>
-      <w:proofErr w:type="gramStart"/>
+        <w:t xml:space="preserve">ORMAL_1.value.SIG_SUBJECT=${subject.T != null ? </w:t>
+      </w:r>
       <w:r>
         <w:rPr>
           <w:lang w:val="en-US"/>
         </w:rPr>
-        <w:t>subject.T</w:t>
-      </w:r>
-      <w:proofErr w:type="spellEnd"/>
-      <w:proofErr w:type="gramEnd"/>
-      <w:r>
-        <w:rPr>
-          <w:lang w:val="en-US"/>
-        </w:rPr>
-        <w:t xml:space="preserve"> != null ? </w:t>
-      </w:r>
-      <w:r>
-        <w:rPr>
-          <w:lang w:val="en-US"/>
-        </w:rPr>
-        <w:t>(</w:t>
-      </w:r>
-      <w:proofErr w:type="spellStart"/>
-      <w:proofErr w:type="gramStart"/>
-      <w:r>
-        <w:rPr>
-          <w:lang w:val="en-US"/>
-        </w:rPr>
-        <w:t>subject.T</w:t>
-      </w:r>
-      <w:proofErr w:type="spellEnd"/>
-      <w:proofErr w:type="gramEnd"/>
-      <w:r>
-        <w:rPr>
-          <w:lang w:val="en-US"/>
-        </w:rPr>
-        <w:t xml:space="preserve"> + " ") : ""}${subject.CN}</w:t>
+        <w:t>(subject.T + " ") : ""}${subject.CN}</w:t>
       </w:r>
     </w:p>
     <w:p>
@@ -6610,21 +5652,7 @@
         <w:rPr>
           <w:lang w:val="en-US"/>
         </w:rPr>
-        <w:t>sig_</w:t>
-      </w:r>
-      <w:proofErr w:type="gramStart"/>
-      <w:r>
-        <w:rPr>
-          <w:lang w:val="en-US"/>
-        </w:rPr>
-        <w:t>obj.BASE</w:t>
-      </w:r>
-      <w:proofErr w:type="gramEnd"/>
-      <w:r>
-        <w:rPr>
-          <w:lang w:val="en-US"/>
-        </w:rPr>
-        <w:t>_NORMAL_1.table.main.1=SIG_SUBJECT-cv</w:t>
+        <w:t>sig_obj.BASE_NORMAL_1.table.main.1=SIG_SUBJECT-cv</w:t>
       </w:r>
     </w:p>
     <w:p>
@@ -6646,21 +5674,7 @@
         <w:rPr>
           <w:lang w:val="en-US"/>
         </w:rPr>
-        <w:t>sig_</w:t>
-      </w:r>
-      <w:proofErr w:type="gramStart"/>
-      <w:r>
-        <w:rPr>
-          <w:lang w:val="en-US"/>
-        </w:rPr>
-        <w:t>obj.BASE</w:t>
-      </w:r>
-      <w:proofErr w:type="gramEnd"/>
-      <w:r>
-        <w:rPr>
-          <w:lang w:val="en-US"/>
-        </w:rPr>
-        <w:t>_NORMAL_1.table.ma</w:t>
+        <w:t>sig_obj.BASE_NORMAL_1.table.ma</w:t>
       </w:r>
       <w:r>
         <w:rPr>
@@ -6678,21 +5692,7 @@
         <w:rPr>
           <w:lang w:val="en-US"/>
         </w:rPr>
-        <w:t>sig_</w:t>
-      </w:r>
-      <w:proofErr w:type="gramStart"/>
-      <w:r>
-        <w:rPr>
-          <w:lang w:val="en-US"/>
-        </w:rPr>
-        <w:t>obj.BASE</w:t>
-      </w:r>
-      <w:proofErr w:type="gramEnd"/>
-      <w:r>
-        <w:rPr>
-          <w:lang w:val="en-US"/>
-        </w:rPr>
-        <w:t>_NORMAL_1.table.main.Style.valuefont=COURIER,8,NORMAL</w:t>
+        <w:t>sig_obj.BASE_NORMAL_1.table.main.Style.valuefont=COURIER,8,NORMAL</w:t>
       </w:r>
     </w:p>
     <w:p>
@@ -6706,21 +5706,7 @@
         <w:rPr>
           <w:lang w:val="en-US"/>
         </w:rPr>
-        <w:t>sig_</w:t>
-      </w:r>
-      <w:proofErr w:type="gramStart"/>
-      <w:r>
-        <w:rPr>
-          <w:lang w:val="en-US"/>
-        </w:rPr>
-        <w:t>obj.BASE</w:t>
-      </w:r>
-      <w:proofErr w:type="gramEnd"/>
-      <w:r>
-        <w:rPr>
-          <w:lang w:val="en-US"/>
-        </w:rPr>
-        <w:t>_NO</w:t>
+        <w:t>sig_obj.BASE_NO</w:t>
       </w:r>
       <w:r>
         <w:rPr>
@@ -6740,21 +5726,7 @@
         <w:rPr>
           <w:lang w:val="en-US"/>
         </w:rPr>
-        <w:t>sig_</w:t>
-      </w:r>
-      <w:proofErr w:type="gramStart"/>
-      <w:r>
-        <w:rPr>
-          <w:lang w:val="en-US"/>
-        </w:rPr>
-        <w:t>obj.BASE</w:t>
-      </w:r>
-      <w:proofErr w:type="gramEnd"/>
-      <w:r>
-        <w:rPr>
-          <w:lang w:val="en-US"/>
-        </w:rPr>
-        <w:t>_NORMAL_1.table</w:t>
+        <w:t>sig_obj.BASE_NORMAL_1.table</w:t>
       </w:r>
       <w:r>
         <w:rPr>
@@ -6774,21 +5746,7 @@
         <w:rPr>
           <w:lang w:val="en-US"/>
         </w:rPr>
-        <w:t>sig_</w:t>
-      </w:r>
-      <w:proofErr w:type="gramStart"/>
-      <w:r>
-        <w:rPr>
-          <w:lang w:val="en-US"/>
-        </w:rPr>
-        <w:t>obj.BASE</w:t>
-      </w:r>
-      <w:proofErr w:type="gramEnd"/>
-      <w:r>
-        <w:rPr>
-          <w:lang w:val="en-US"/>
-        </w:rPr>
-        <w:t>_NORMAL_1</w:t>
+        <w:t>sig_obj.BASE_NORMAL_1</w:t>
       </w:r>
       <w:r>
         <w:rPr>
@@ -6808,21 +5766,7 @@
         <w:rPr>
           <w:lang w:val="en-US"/>
         </w:rPr>
-        <w:t>sig_</w:t>
-      </w:r>
-      <w:proofErr w:type="gramStart"/>
-      <w:r>
-        <w:rPr>
-          <w:lang w:val="en-US"/>
-        </w:rPr>
-        <w:t>obj.BASE</w:t>
-      </w:r>
-      <w:proofErr w:type="gramEnd"/>
-      <w:r>
-        <w:rPr>
-          <w:lang w:val="en-US"/>
-        </w:rPr>
-        <w:t>_NORMAL_1.table.main.Style.border=0.1</w:t>
+        <w:t>sig_obj.BASE_NORMAL_1.table.main.Style.border=0.1</w:t>
       </w:r>
     </w:p>
     <w:p>
@@ -6837,7 +5781,7 @@
       <w:pPr>
         <w:pStyle w:val="Heading2"/>
       </w:pPr>
-      <w:bookmarkStart w:id="12" w:name="_Toc417992179"/>
+      <w:bookmarkStart w:id="12" w:name="_Toc229414989"/>
       <w:r>
         <w:t>Simple Tabelle mit Bild</w:t>
       </w:r>
@@ -6899,11 +5843,9 @@
       <w:r>
         <w:t>‘</w:t>
       </w:r>
-      <w:proofErr w:type="spellStart"/>
       <w:r>
         <w:t>imagescaletofit</w:t>
       </w:r>
-      <w:proofErr w:type="spellEnd"/>
       <w:r>
         <w:t>‘ fixiert.</w:t>
       </w:r>
@@ -6945,21 +5887,7 @@
         <w:rPr>
           <w:lang w:val="en-US"/>
         </w:rPr>
-        <w:t>sig_</w:t>
-      </w:r>
-      <w:proofErr w:type="gramStart"/>
-      <w:r>
-        <w:rPr>
-          <w:lang w:val="en-US"/>
-        </w:rPr>
-        <w:t>obj.BASE</w:t>
-      </w:r>
-      <w:proofErr w:type="gramEnd"/>
-      <w:r>
-        <w:rPr>
-          <w:lang w:val="en-US"/>
-        </w:rPr>
-        <w:t>_NORMAL_1.table.main.Style.imagescaletofit=80.0;80.0</w:t>
+        <w:t>sig_obj.BASE_NORMAL_1.table.main.Style.imagescaletofit=80.0;80.0</w:t>
       </w:r>
     </w:p>
     <w:p>
@@ -6973,21 +5901,7 @@
         <w:rPr>
           <w:lang w:val="en-US"/>
         </w:rPr>
-        <w:t>sig_</w:t>
-      </w:r>
-      <w:proofErr w:type="gramStart"/>
-      <w:r>
-        <w:rPr>
-          <w:lang w:val="en-US"/>
-        </w:rPr>
-        <w:t>obj.BASE</w:t>
-      </w:r>
-      <w:proofErr w:type="gramEnd"/>
-      <w:r>
-        <w:rPr>
-          <w:lang w:val="en-US"/>
-        </w:rPr>
-        <w:t>_NORMA</w:t>
+        <w:t>sig_obj.BASE_NORMA</w:t>
       </w:r>
       <w:r>
         <w:rPr>
@@ -7007,30 +5921,8 @@
         <w:rPr>
           <w:lang w:val="en-US"/>
         </w:rPr>
-        <w:t>sig_</w:t>
-      </w:r>
-      <w:proofErr w:type="gramStart"/>
-      <w:r>
-        <w:rPr>
-          <w:lang w:val="en-US"/>
-        </w:rPr>
-        <w:t>obj.BASE</w:t>
-      </w:r>
-      <w:proofErr w:type="gramEnd"/>
-      <w:r>
-        <w:rPr>
-          <w:lang w:val="en-US"/>
-        </w:rPr>
-        <w:t>_NORMAL_1.table.main.2=SIG_LABEL-</w:t>
-      </w:r>
-      <w:proofErr w:type="spellStart"/>
-      <w:r>
-        <w:rPr>
-          <w:lang w:val="en-US"/>
-        </w:rPr>
-        <w:t>i</w:t>
-      </w:r>
-      <w:proofErr w:type="spellEnd"/>
+        <w:t>sig_obj.BASE_NORMAL_1.table.main.2=SIG_LABEL-i</w:t>
+      </w:r>
     </w:p>
     <w:p>
       <w:pPr>
@@ -7046,7 +5938,7 @@
         <w:br/>
       </w:r>
     </w:p>
-    <w:bookmarkStart w:id="13" w:name="_Toc417992180"/>
+    <w:bookmarkStart w:id="13" w:name="_Toc229414990"/>
     <w:p>
       <w:pPr>
         <w:pStyle w:val="Heading2"/>
@@ -7192,15 +6084,7 @@
         <w:t xml:space="preserve">Hier wurde in den rechten Teil der Haupttabelle eine 2. </w:t>
       </w:r>
       <w:r>
-        <w:t xml:space="preserve">Tabelle(rot) </w:t>
-      </w:r>
-      <w:proofErr w:type="gramStart"/>
-      <w:r>
-        <w:t>mit zusätzliche Infos</w:t>
-      </w:r>
-      <w:proofErr w:type="gramEnd"/>
-      <w:r>
-        <w:t>, basierend auf Key-Value Pairs, eingefügt.</w:t>
+        <w:t>Tabelle(rot) mit zusätzliche Infos, basierend auf Key-Value Pairs, eingefügt.</w:t>
       </w:r>
     </w:p>
     <w:p>
@@ -7234,28 +6118,7 @@
         <w:rPr>
           <w:lang w:val="en-US"/>
         </w:rPr>
-        <w:t>sig_</w:t>
-      </w:r>
-      <w:proofErr w:type="gramStart"/>
-      <w:r>
-        <w:rPr>
-          <w:lang w:val="en-US"/>
-        </w:rPr>
-        <w:t>obj.BASE</w:t>
-      </w:r>
-      <w:proofErr w:type="gramEnd"/>
-      <w:r>
-        <w:rPr>
-          <w:lang w:val="en-US"/>
-        </w:rPr>
-        <w:t>_NORMAL_1.table.main.1=</w:t>
-      </w:r>
-      <w:proofErr w:type="spellStart"/>
-      <w:r>
-        <w:rPr>
-          <w:lang w:val="en-US"/>
-        </w:rPr>
-        <w:t>SIG_LABEL-i|</w:t>
+        <w:t>sig_obj.BASE_NORMAL_1.table.main.1=SIG_LABEL-i|</w:t>
       </w:r>
       <w:r>
         <w:rPr>
@@ -7264,7 +6127,6 @@
         </w:rPr>
         <w:t>TABLE-info</w:t>
       </w:r>
-      <w:proofErr w:type="spellEnd"/>
     </w:p>
     <w:p>
       <w:pPr>
@@ -7277,63 +6139,7 @@
         <w:rPr>
           <w:lang w:val="en-US"/>
         </w:rPr>
-        <w:t>sig_</w:t>
-      </w:r>
-      <w:proofErr w:type="gramStart"/>
-      <w:r>
-        <w:rPr>
-          <w:lang w:val="en-US"/>
-        </w:rPr>
-        <w:t>obj.BASE</w:t>
-      </w:r>
-      <w:proofErr w:type="gramEnd"/>
-      <w:r>
-        <w:rPr>
-          <w:lang w:val="en-US"/>
-        </w:rPr>
-        <w:t xml:space="preserve">_NORMAL_1.table.main.ColsWidth=1 6       #2 </w:t>
-      </w:r>
-      <w:proofErr w:type="spellStart"/>
-      <w:r>
-        <w:rPr>
-          <w:lang w:val="en-US"/>
-        </w:rPr>
-        <w:t>Spalten</w:t>
-      </w:r>
-      <w:proofErr w:type="spellEnd"/>
-      <w:r>
-        <w:rPr>
-          <w:lang w:val="en-US"/>
-        </w:rPr>
-        <w:t xml:space="preserve">; </w:t>
-      </w:r>
-      <w:proofErr w:type="spellStart"/>
-      <w:r>
-        <w:rPr>
-          <w:lang w:val="en-US"/>
-        </w:rPr>
-        <w:t>Verhältnis</w:t>
-      </w:r>
-      <w:proofErr w:type="spellEnd"/>
-      <w:r>
-        <w:rPr>
-          <w:lang w:val="en-US"/>
-        </w:rPr>
-        <w:t xml:space="preserve"> </w:t>
-      </w:r>
-      <w:proofErr w:type="spellStart"/>
-      <w:r>
-        <w:rPr>
-          <w:lang w:val="en-US"/>
-        </w:rPr>
-        <w:t>Breite</w:t>
-      </w:r>
-      <w:proofErr w:type="spellEnd"/>
-      <w:r>
-        <w:rPr>
-          <w:lang w:val="en-US"/>
-        </w:rPr>
-        <w:t xml:space="preserve"> 1:6</w:t>
+        <w:t>sig_obj.BASE_NORMAL_1.table.main.ColsWidth=1 6       #2 Spalten; Verhältnis Breite 1:6</w:t>
       </w:r>
     </w:p>
     <w:p>
@@ -7886,16 +6692,8 @@
               <w:rPr>
                 <w:lang w:val="en-US"/>
               </w:rPr>
-              <w:t xml:space="preserve">PDF-AS API </w:t>
-            </w:r>
-            <w:proofErr w:type="spellStart"/>
-            <w:r>
-              <w:rPr>
-                <w:lang w:val="en-US"/>
-              </w:rPr>
-              <w:t>Dokumentation</w:t>
-            </w:r>
-            <w:proofErr w:type="spellEnd"/>
+              <w:t>PDF-AS API Dokumentation</w:t>
+            </w:r>
             <w:r>
               <w:rPr>
                 <w:lang w:val="en-US"/>
@@ -8270,23 +7068,13 @@
               <w:szCs w:val="18"/>
             </w:rPr>
           </w:pPr>
-          <w:proofErr w:type="spellStart"/>
           <w:r>
             <w:rPr>
               <w:rFonts w:asciiTheme="majorHAnsi" w:hAnsiTheme="majorHAnsi"/>
               <w:sz w:val="18"/>
               <w:szCs w:val="18"/>
             </w:rPr>
-            <w:t>Sandgasse</w:t>
-          </w:r>
-          <w:proofErr w:type="spellEnd"/>
-          <w:r>
-            <w:rPr>
-              <w:rFonts w:asciiTheme="majorHAnsi" w:hAnsiTheme="majorHAnsi"/>
-              <w:sz w:val="18"/>
-              <w:szCs w:val="18"/>
-            </w:rPr>
-            <w:t xml:space="preserve"> 38a</w:t>
+            <w:t>Sandgasse 38a</w:t>
           </w:r>
           <w:r>
             <w:rPr>
@@ -12125,7 +10913,7 @@
 </file>
 
 <file path=customXml/itemProps3.xml><?xml version="1.0" encoding="utf-8"?>
-<ds:datastoreItem xmlns:ds="http://schemas.openxmlformats.org/officeDocument/2006/customXml" ds:itemID="{12E54A2C-3E68-4920-96C1-FD991CFA62C6}">
+<ds:datastoreItem xmlns:ds="http://schemas.openxmlformats.org/officeDocument/2006/customXml" ds:itemID="{4575D26B-1B03-479B-B3E7-FD24A37830E9}">
   <ds:schemaRefs>
     <ds:schemaRef ds:uri="http://schemas.openxmlformats.org/officeDocument/2006/bibliography"/>
   </ds:schemaRefs>

</xml_diff>